<commit_message>
docs(enrichment): add executive report and updated docx on Exa and AI enrichment cost analysis
</commit_message>
<xml_diff>
--- a/docs/ProspectPlus_AI_Enrichment_Cost_Analysis.docx
+++ b/docs/ProspectPlus_AI_Enrichment_Cost_Analysis.docx
@@ -5,17 +5,17 @@
     <w:p>
       <w:pPr>
         <w:pStyle w:val="Title"/>
-        <w:spacing w:after="180"/>
+        <w:spacing w:after="160"/>
       </w:pPr>
       <w:r>
         <w:rPr>
           <w:b/>
           <w:bCs/>
           <w:color w:val="095C7B"/>
-          <w:sz w:val="38"/>
-          <w:szCs w:val="38"/>
-        </w:rPr>
-        <w:t xml:space="preserve">AI Lead Enrichment Cost Analysis &amp; Infrastructure Guide</w:t>
+          <w:sz w:val="36"/>
+          <w:szCs w:val="36"/>
+        </w:rPr>
+        <w:t xml:space="preserve">Lead Intelligence Engine &amp; Enrichment Cost Analysis</w:t>
       </w:r>
     </w:p>
     <w:tbl>
@@ -58,14 +58,14 @@
                 <w:sz w:val="19"/>
                 <w:szCs w:val="19"/>
               </w:rPr>
-              <w:t xml:space="preserve">Target Audience: </w:t>
+              <w:t xml:space="preserve">Document Reference: </w:t>
             </w:r>
             <w:r>
               <w:rPr>
                 <w:sz w:val="19"/>
                 <w:szCs w:val="19"/>
               </w:rPr>
-              <w:t xml:space="preserve">Executive Management &amp; Operations Leadership
+              <w:t xml:space="preserve">MP-AI-2026-FINAL (Executive Briefing)
 </w:t>
             </w:r>
             <w:r>
@@ -75,14 +75,14 @@
                 <w:sz w:val="19"/>
                 <w:szCs w:val="19"/>
               </w:rPr>
-              <w:t xml:space="preserve">System: </w:t>
+              <w:t xml:space="preserve">Target Audience: </w:t>
             </w:r>
             <w:r>
               <w:rPr>
                 <w:sz w:val="19"/>
                 <w:szCs w:val="19"/>
               </w:rPr>
-              <w:t xml:space="preserve">ProspectPlus Outbound Lead Engine
+              <w:t xml:space="preserve">Executive Leadership, Finance &amp; Sales Operations
 </w:t>
             </w:r>
             <w:r>
@@ -92,14 +92,14 @@
                 <w:sz w:val="19"/>
                 <w:szCs w:val="19"/>
               </w:rPr>
-              <w:t xml:space="preserve">Version: </w:t>
+              <w:t xml:space="preserve">Date: </w:t>
             </w:r>
             <w:r>
               <w:rPr>
                 <w:sz w:val="19"/>
                 <w:szCs w:val="19"/>
               </w:rPr>
-              <w:t xml:space="preserve">1.1 (Updated with Dedicated Exa Account &amp; GCP Secret Manager)
+              <w:t xml:space="preserve">October 14, 2026
 </w:t>
             </w:r>
             <w:r>
@@ -109,31 +109,14 @@
                 <w:sz w:val="19"/>
                 <w:szCs w:val="19"/>
               </w:rPr>
-              <w:t xml:space="preserve">Date: </w:t>
+              <w:t xml:space="preserve">Scope: </w:t>
             </w:r>
             <w:r>
               <w:rPr>
                 <w:sz w:val="19"/>
                 <w:szCs w:val="19"/>
               </w:rPr>
-              <w:t xml:space="preserve">October 14, 2026
-</w:t>
-            </w:r>
-            <w:r>
-              <w:rPr>
-                <w:b/>
-                <w:bCs/>
-                <w:sz w:val="19"/>
-                <w:szCs w:val="19"/>
-              </w:rPr>
-              <w:t xml:space="preserve">Special Audit: </w:t>
-            </w:r>
-            <w:r>
-              <w:rPr>
-                <w:sz w:val="19"/>
-                <w:szCs w:val="19"/>
-              </w:rPr>
-              <w:t xml:space="preserve">Batch enrichment run of 3,000 leads on October 12, 2026</w:t>
+              <w:t xml:space="preserve">Unified 1-Click Intelligence Hub, Oct 12 Batch Audit, &amp; Exa Search Architecture</w:t>
             </w:r>
           </w:p>
         </w:tc>
@@ -141,7 +124,7 @@
     </w:tbl>
     <w:p>
       <w:pPr>
-        <w:spacing w:after="200"/>
+        <w:spacing w:after="180"/>
       </w:pPr>
     </w:p>
     <w:p>
@@ -162,27 +145,16 @@
     </w:p>
     <w:p>
       <w:r>
-        <w:t xml:space="preserve">This report details the technical architecture, operating expenses, and future cost models for the AI Lead Enrichment and Web Scraping engine in ProspectPlus, including the 3,000 leads processed on October 12, 2026, and the dedicated Exa search account setup.</w:t>
-      </w:r>
-    </w:p>
-    <w:p>
-      <w:r>
-        <w:rPr>
-          <w:b/>
-          <w:bCs/>
-        </w:rPr>
-        <w:t xml:space="preserve">Key Findings:
+        <w:rPr>
+          <w:b/>
+          <w:bCs/>
+          <w:color w:val="095C7B"/>
+        </w:rPr>
+        <w:t xml:space="preserve">• The October 12th Batch Run (3,000 Leads):
 </w:t>
       </w:r>
       <w:r>
-        <w:rPr>
-          <w:b/>
-          <w:bCs/>
-        </w:rPr>
-        <w:t xml:space="preserve">• October 12 Batch Run (3,000 Leads): </w:t>
-      </w:r>
-      <w:r>
-        <w:t xml:space="preserve">Total cost incurred was </w:t>
+        <w:t xml:space="preserve">Total cost across the 3,000 leads was </w:t>
       </w:r>
       <w:r>
         <w:rPr>
@@ -193,117 +165,112 @@
         <w:t xml:space="preserve">$2.61 USD (approx. $4.06 AUD)</w:t>
       </w:r>
       <w:r>
-        <w:t xml:space="preserve"> across the entire cohort (</w:t>
-      </w:r>
-      <w:r>
-        <w:rPr>
-          <w:b/>
-          <w:bCs/>
-        </w:rPr>
-        <w:t xml:space="preserve">less than one-tenth of a cent per lead</w:t>
-      </w:r>
-      <w:r>
-        <w:t xml:space="preserve">). Exa search cost for this run was </w:t>
-      </w:r>
-      <w:r>
-        <w:rPr>
-          <w:b/>
-          <w:bCs/>
-        </w:rPr>
-        <w:t xml:space="preserve">$0.00</w:t>
-      </w:r>
-      <w:r>
-        <w:t xml:space="preserve"> (Exa live search was introduced on Oct 14).
+        <w:t xml:space="preserve"> (&lt; $0.0014 AUD / lead). On that date, the pipeline executed direct website scraping + Gemini AI only. Exa neural search had not yet been added, resulting in $0.00 Exa charges.
 </w:t>
       </w:r>
       <w:r>
         <w:rPr>
           <w:b/>
           <w:bCs/>
-        </w:rPr>
-        <w:t xml:space="preserve">• Exa Account &amp; Secret Manager Setup: </w:t>
-      </w:r>
-      <w:r>
-        <w:t xml:space="preserve">A dedicated MailPlus Exa API key has been provisioned and secured in </w:t>
-      </w:r>
-      <w:r>
-        <w:rPr>
-          <w:b/>
-          <w:bCs/>
-        </w:rPr>
-        <w:t xml:space="preserve">Google Cloud Secret Manager</w:t>
-      </w:r>
-      <w:r>
-        <w:t xml:space="preserve">. It is injected at cloud container runtime — </w:t>
-      </w:r>
-      <w:r>
-        <w:rPr>
-          <w:b/>
-          <w:bCs/>
-        </w:rPr>
-        <w:t xml:space="preserve">zero API keys or secrets are exposed or pushed to GitHub</w:t>
-      </w:r>
-      <w:r>
-        <w:t xml:space="preserve">. The account includes </w:t>
-      </w:r>
-      <w:r>
-        <w:rPr>
-          <w:b/>
-          <w:bCs/>
-        </w:rPr>
-        <w:t xml:space="preserve">$10 USD / month recurring free credits (~1,500 - 2,000 free searches/mo)</w:t>
-      </w:r>
-      <w:r>
-        <w:t xml:space="preserve"> with a dedicated </w:t>
-      </w:r>
-      <w:r>
-        <w:rPr>
-          <w:b/>
-          <w:bCs/>
-        </w:rPr>
-        <w:t xml:space="preserve">10 QPS (600 requests/min)</w:t>
-      </w:r>
-      <w:r>
-        <w:t xml:space="preserve"> throughput limit.
+          <w:color w:val="095C7B"/>
+        </w:rPr>
+        <w:t xml:space="preserve">• The Unified 1-Click Experience (Current Production UI):
 </w:t>
       </w:r>
       <w:r>
-        <w:rPr>
-          <w:b/>
-          <w:bCs/>
-        </w:rPr>
-        <w:t xml:space="preserve">• Commercial Vendor Comparison: </w:t>
-      </w:r>
-      <w:r>
-        <w:t xml:space="preserve">Commercial B2B data providers (Apollo, ZoomInfo, Clay) charge $0.20 – $1.00+ per enriched lead, which would have cost </w:t>
-      </w:r>
-      <w:r>
-        <w:rPr>
-          <w:b/>
-          <w:bCs/>
-          <w:color w:val="B91C1C"/>
-        </w:rPr>
-        <w:t xml:space="preserve">$600 to $3,000+ AUD</w:t>
-      </w:r>
-      <w:r>
-        <w:t xml:space="preserve"> for 3,000 leads. ProspectPlus delivered custom MailPlus logistics intel for under $5 AUD (99.5% savings).
+        <w:t xml:space="preserve">On October 14th, the platform was upgraded to a unified 1-click experience ("Run Complete Intel" on the lead profile, and "Batch Enrich" on the leads list). Reps click one button, and the system executes both the direct website crawler and live Exa/LinkedIn indexing in parallel in 5–8 seconds.
 </w:t>
       </w:r>
       <w:r>
         <w:rPr>
           <w:b/>
           <w:bCs/>
-        </w:rPr>
-        <w:t xml:space="preserve">• Zero Recurring Costs: </w:t>
-      </w:r>
-      <w:r>
-        <w:t xml:space="preserve">All enriched data is stored permanently in Firestore. Reviewing, filtering, or dialling leads makes zero API calls.</w:t>
+          <w:color w:val="095C7B"/>
+        </w:rPr>
+        <w:t xml:space="preserve">• Future Projections for the Unified Engine:
+</w:t>
+      </w:r>
+      <w:r>
+        <w:t xml:space="preserve">Powered by our dedicated MailPlus Exa account. MailPlus receives </w:t>
+      </w:r>
+      <w:r>
+        <w:rPr>
+          <w:b/>
+          <w:bCs/>
+        </w:rPr>
+        <w:t xml:space="preserve">$10.00 USD / month in recurring free credits</w:t>
+      </w:r>
+      <w:r>
+        <w:t xml:space="preserve"> (~1,500 – 2,000 free searches/month). 1,000 leads/month costs </w:t>
+      </w:r>
+      <w:r>
+        <w:rPr>
+          <w:b/>
+          <w:bCs/>
+        </w:rPr>
+        <w:t xml:space="preserve">~$2.50 AUD</w:t>
+      </w:r>
+      <w:r>
+        <w:t xml:space="preserve"> (covered almost entirely by free credits), and 3,000 leads/month costs </w:t>
+      </w:r>
+      <w:r>
+        <w:rPr>
+          <w:b/>
+          <w:bCs/>
+        </w:rPr>
+        <w:t xml:space="preserve">~$45 – $65 AUD total.
+</w:t>
+      </w:r>
+      <w:r>
+        <w:rPr>
+          <w:b/>
+          <w:bCs/>
+        </w:rPr>
+        <w:t xml:space="preserve">• Commercial Vendor Benchmark: </w:t>
+      </w:r>
+      <w:r>
+        <w:t xml:space="preserve">Third-party providers (ZoomInfo, Apollo, Clay) charge $0.20 – $1.00+ per lead ($600 to $3,000+ AUD for 3k leads). ProspectPlus delivers tailored MailPlus logistics data at </w:t>
+      </w:r>
+      <w:r>
+        <w:rPr>
+          <w:b/>
+          <w:bCs/>
+        </w:rPr>
+        <w:t xml:space="preserve">95% to 99.5% lower cost.
+</w:t>
+      </w:r>
+      <w:r>
+        <w:rPr>
+          <w:b/>
+          <w:bCs/>
+        </w:rPr>
+        <w:t xml:space="preserve">• Enterprise Security: </w:t>
+      </w:r>
+      <w:r>
+        <w:t xml:space="preserve">The Exa API key is stored in </w:t>
+      </w:r>
+      <w:r>
+        <w:rPr>
+          <w:b/>
+          <w:bCs/>
+        </w:rPr>
+        <w:t xml:space="preserve">Google Cloud Secret Manager (projects/mailplus-outbound-leads-crm/secrets/EXA_API_KEY)</w:t>
+      </w:r>
+      <w:r>
+        <w:t xml:space="preserve">. Access is restricted to the App Hosting runtime container. </w:t>
+      </w:r>
+      <w:r>
+        <w:rPr>
+          <w:b/>
+          <w:bCs/>
+        </w:rPr>
+        <w:t xml:space="preserve">Zero keys exist in GitHub.</w:t>
       </w:r>
     </w:p>
     <w:p>
       <w:pPr>
         <w:pStyle w:val="Heading1"/>
-        <w:spacing w:after="140" w:before="280"/>
+        <w:spacing w:after="120" w:before="260"/>
       </w:pPr>
       <w:r>
         <w:rPr>
@@ -313,7 +280,22 @@
           <w:sz w:val="28"/>
           <w:szCs w:val="28"/>
         </w:rPr>
-        <w:t xml:space="preserve">2. Cost Audit: 3,000 Leads Batch Run (October 12, 2026)</w:t>
+        <w:t xml:space="preserve">2. Cost Audit: The 3,000 Leads Enriched on October 12th</w:t>
+      </w:r>
+    </w:p>
+    <w:p>
+      <w:r>
+        <w:t xml:space="preserve">On October 12, 2026, 3,000 outbound leads were enriched via </w:t>
+      </w:r>
+      <w:r>
+        <w:rPr>
+          <w:b/>
+          <w:bCs/>
+        </w:rPr>
+        <w:t xml:space="preserve">Direct Website Scraping + Google Gemini 2.5 Flash</w:t>
+      </w:r>
+      <w:r>
+        <w:t xml:space="preserve">. Exa was not yet in the codebase, resulting in $0.00 Exa charges:</w:t>
       </w:r>
     </w:p>
     <w:tbl>
@@ -451,7 +433,7 @@
           </w:tcPr>
           <w:p>
             <w:r>
-              <w:t xml:space="preserve">3,000 target domain HTTP requests + sitemap probing</w:t>
+              <w:t xml:space="preserve">3,000 domain fetches + cart inspection</w:t>
             </w:r>
           </w:p>
         </w:tc>
@@ -517,7 +499,7 @@
           </w:tcPr>
           <w:p>
             <w:r>
-              <w:t xml:space="preserve">~24M tokens (avg. 8k tokens per lead)</w:t>
+              <w:t xml:space="preserve">~24M tokens (avg. 8k tokens/lead)</w:t>
             </w:r>
           </w:p>
         </w:tc>
@@ -583,7 +565,7 @@
           </w:tcPr>
           <w:p>
             <w:r>
-              <w:t xml:space="preserve">~2.7M tokens (structured JSON extraction)</w:t>
+              <w:t xml:space="preserve">~2.7M tokens (structured JSON)</w:t>
             </w:r>
           </w:p>
         </w:tc>
@@ -634,22 +616,22 @@
                 <w:b/>
                 <w:bCs/>
               </w:rPr>
-              <w:t xml:space="preserve">Exa Semantic Search</w:t>
-            </w:r>
-          </w:p>
-        </w:tc>
-        <w:tc>
-          <w:tcPr>
-            <w:tcBorders>
-              <w:top w:val="single" w:color="CBD5E1" w:sz="4"/>
-              <w:left w:val="single" w:color="CBD5E1" w:sz="4"/>
-              <w:bottom w:val="single" w:color="CBD5E1" w:sz="4"/>
-              <w:right w:val="single" w:color="CBD5E1" w:sz="4"/>
-            </w:tcBorders>
-          </w:tcPr>
-          <w:p>
-            <w:r>
-              <w:t xml:space="preserve">0 requests (Exa live search added Oct 14)</w:t>
+              <w:t xml:space="preserve">Exa Live Search</w:t>
+            </w:r>
+          </w:p>
+        </w:tc>
+        <w:tc>
+          <w:tcPr>
+            <w:tcBorders>
+              <w:top w:val="single" w:color="CBD5E1" w:sz="4"/>
+              <w:left w:val="single" w:color="CBD5E1" w:sz="4"/>
+              <w:bottom w:val="single" w:color="CBD5E1" w:sz="4"/>
+              <w:right w:val="single" w:color="CBD5E1" w:sz="4"/>
+            </w:tcBorders>
+          </w:tcPr>
+          <w:p>
+            <w:r>
+              <w:t xml:space="preserve">0 requests (Exa added Oct 14)</w:t>
             </w:r>
           </w:p>
         </w:tc>
@@ -730,7 +712,7 @@
           </w:tcPr>
           <w:p>
             <w:r>
-              <w:t xml:space="preserve">Within 20k/day Free Quota</w:t>
+              <w:t xml:space="preserve">Within Free 20k/day</w:t>
             </w:r>
           </w:p>
         </w:tc>
@@ -768,7 +750,7 @@
                 <w:bCs/>
                 <w:color w:val="047857"/>
               </w:rPr>
-              <w:t xml:space="preserve">TOTAL AUDITED COST</w:t>
+              <w:t xml:space="preserve">TOTAL AUDITED COST (OCT 12)</w:t>
             </w:r>
           </w:p>
         </w:tc>
@@ -838,7 +820,7 @@
     <w:p>
       <w:pPr>
         <w:pStyle w:val="Heading1"/>
-        <w:spacing w:after="140" w:before="280"/>
+        <w:spacing w:after="120" w:before="260"/>
       </w:pPr>
       <w:r>
         <w:rPr>
@@ -848,104 +830,7 @@
           <w:sz w:val="28"/>
           <w:szCs w:val="28"/>
         </w:rPr>
-        <w:t xml:space="preserve">3. Exa Semantic Search: Account &amp; Security Architecture</w:t>
-      </w:r>
-    </w:p>
-    <w:p>
-      <w:r>
-        <w:rPr>
-          <w:b/>
-          <w:bCs/>
-        </w:rPr>
-        <w:t xml:space="preserve">• Account Provisioning &amp; Billing: </w:t>
-      </w:r>
-      <w:r>
-        <w:t xml:space="preserve">Exa powers the Agent Reach layer (domain lookup, live carrier dispatch policy detection, and LinkedIn decision-maker extraction). The account is registered to MailPlus and provides </w:t>
-      </w:r>
-      <w:r>
-        <w:rPr>
-          <w:b/>
-          <w:bCs/>
-        </w:rPr>
-        <w:t xml:space="preserve">$10.00 USD in free credits every month </w:t>
-      </w:r>
-      <w:r>
-        <w:t xml:space="preserve">(~1,500 to 2,000 free searches/month). Beyond free credits, billing is pay-as-you-go at ~$5 per 1,000 searches (~$0.005/search).
-</w:t>
-      </w:r>
-      <w:r>
-        <w:rPr>
-          <w:b/>
-          <w:bCs/>
-        </w:rPr>
-        <w:t xml:space="preserve">• Dedicated Rate Limits: </w:t>
-      </w:r>
-      <w:r>
-        <w:t xml:space="preserve">The registered API key unlocks a dedicated throughput limit of </w:t>
-      </w:r>
-      <w:r>
-        <w:rPr>
-          <w:b/>
-          <w:bCs/>
-        </w:rPr>
-        <w:t xml:space="preserve">10 Queries Per Second (600 requests/min) </w:t>
-      </w:r>
-      <w:r>
-        <w:t xml:space="preserve">and up to 50 active parallel agent tasks. Because ProspectPlus processes batch leads in controlled pools of 3 to 6 concurrent requests (~1–2 QPS), the application runs at </w:t>
-      </w:r>
-      <w:r>
-        <w:rPr>
-          <w:b/>
-          <w:bCs/>
-        </w:rPr>
-        <w:t xml:space="preserve">10% to 20% of the account ceiling</w:t>
-      </w:r>
-      <w:r>
-        <w:t xml:space="preserve">, completely preventing dropped requests or throttling.
-</w:t>
-      </w:r>
-      <w:r>
-        <w:rPr>
-          <w:b/>
-          <w:bCs/>
-        </w:rPr>
-        <w:t xml:space="preserve">• Secret Manager &amp; Zero-Exposure Security: </w:t>
-      </w:r>
-      <w:r>
-        <w:t xml:space="preserve">The Exa API key is stored in </w:t>
-      </w:r>
-      <w:r>
-        <w:rPr>
-          <w:b/>
-          <w:bCs/>
-        </w:rPr>
-        <w:t xml:space="preserve">Google Cloud Secret Manager (projects/mailplus-outbound-leads-crm/secrets/EXA_API_KEY)</w:t>
-      </w:r>
-      <w:r>
-        <w:t xml:space="preserve"> with IAM access granted only to the App Hosting backend service account. In local development, it is loaded from .env.local (strictly git-ignored). </w:t>
-      </w:r>
-      <w:r>
-        <w:rPr>
-          <w:b/>
-          <w:bCs/>
-        </w:rPr>
-        <w:t xml:space="preserve">No secrets or API keys are ever committed to GitHub or exposed in frontend code.</w:t>
-      </w:r>
-    </w:p>
-    <w:p>
-      <w:pPr>
-        <w:pStyle w:val="Heading1"/>
-        <w:spacing w:after="140" w:before="280"/>
-      </w:pPr>
-      <w:r>
-        <w:rPr>
-          <w:b/>
-          <w:bCs/>
-          <w:color w:val="095C7B"/>
-          <w:sz w:val="28"/>
-          <w:szCs w:val="28"/>
-        </w:rPr>
-        <w:t xml:space="preserve">4. Future Projections &amp; Budget Forecast</w:t>
+        <w:t xml:space="preserve">3. Side-by-Side Cost Comparison &amp; Future Projections</w:t>
       </w:r>
     </w:p>
     <w:tbl>
@@ -984,7 +869,7 @@
                 <w:bCs/>
                 <w:color w:val="FFFFFF"/>
               </w:rPr>
-              <w:t xml:space="preserve">Monthly Volume</w:t>
+              <w:t xml:space="preserve">Scenario / Volume</w:t>
             </w:r>
           </w:p>
         </w:tc>
@@ -1005,7 +890,7 @@
                 <w:bCs/>
                 <w:color w:val="FFFFFF"/>
               </w:rPr>
-              <w:t xml:space="preserve">Standard AI (Gemini)</w:t>
+              <w:t xml:space="preserve">Unified Complete Intel (Live Engine)</w:t>
             </w:r>
           </w:p>
         </w:tc>
@@ -1026,7 +911,7 @@
                 <w:bCs/>
                 <w:color w:val="FFFFFF"/>
               </w:rPr>
-              <w:t xml:space="preserve">Unified Intel (+ Exa Search)</w:t>
+              <w:t xml:space="preserve">Scraping + Gemini Only (Oct 12 Run)</w:t>
             </w:r>
           </w:p>
         </w:tc>
@@ -1047,7 +932,7 @@
                 <w:bCs/>
                 <w:color w:val="FFFFFF"/>
               </w:rPr>
-              <w:t xml:space="preserve">Commercial Alternatives</w:t>
+              <w:t xml:space="preserve">Commercial Market Rate</w:t>
             </w:r>
           </w:p>
         </w:tc>
@@ -1064,52 +949,61 @@
           </w:tcPr>
           <w:p>
             <w:r>
-              <w:t xml:space="preserve">500 leads / month</w:t>
-            </w:r>
-          </w:p>
-        </w:tc>
-        <w:tc>
-          <w:tcPr>
-            <w:tcBorders>
-              <w:top w:val="single" w:color="CBD5E1" w:sz="4"/>
-              <w:left w:val="single" w:color="CBD5E1" w:sz="4"/>
-              <w:bottom w:val="single" w:color="CBD5E1" w:sz="4"/>
-              <w:right w:val="single" w:color="CBD5E1" w:sz="4"/>
-            </w:tcBorders>
-          </w:tcPr>
-          <w:p>
-            <w:r>
-              <w:t xml:space="preserve">$0.00 (Free Quota)</w:t>
-            </w:r>
-          </w:p>
-        </w:tc>
-        <w:tc>
-          <w:tcPr>
-            <w:tcBorders>
-              <w:top w:val="single" w:color="CBD5E1" w:sz="4"/>
-              <w:left w:val="single" w:color="CBD5E1" w:sz="4"/>
-              <w:bottom w:val="single" w:color="CBD5E1" w:sz="4"/>
-              <w:right w:val="single" w:color="CBD5E1" w:sz="4"/>
-            </w:tcBorders>
-          </w:tcPr>
-          <w:p>
-            <w:r>
-              <w:t xml:space="preserve">$0.00 (Covered by $10 Free Tier)</w:t>
-            </w:r>
-          </w:p>
-        </w:tc>
-        <w:tc>
-          <w:tcPr>
-            <w:tcBorders>
-              <w:top w:val="single" w:color="CBD5E1" w:sz="4"/>
-              <w:left w:val="single" w:color="CBD5E1" w:sz="4"/>
-              <w:bottom w:val="single" w:color="CBD5E1" w:sz="4"/>
-              <w:right w:val="single" w:color="CBD5E1" w:sz="4"/>
-            </w:tcBorders>
-          </w:tcPr>
-          <w:p>
-            <w:r>
-              <w:t xml:space="preserve">$150 – $400 AUD</w:t>
+              <w:rPr>
+                <w:b/>
+                <w:bCs/>
+              </w:rPr>
+              <w:t xml:space="preserve">Oct 12 Actual Run (3k Leads)</w:t>
+            </w:r>
+          </w:p>
+        </w:tc>
+        <w:tc>
+          <w:tcPr>
+            <w:tcBorders>
+              <w:top w:val="single" w:color="CBD5E1" w:sz="4"/>
+              <w:left w:val="single" w:color="CBD5E1" w:sz="4"/>
+              <w:bottom w:val="single" w:color="CBD5E1" w:sz="4"/>
+              <w:right w:val="single" w:color="CBD5E1" w:sz="4"/>
+            </w:tcBorders>
+          </w:tcPr>
+          <w:p>
+            <w:r>
+              <w:t xml:space="preserve">N/A (Exa added Oct 14)</w:t>
+            </w:r>
+          </w:p>
+        </w:tc>
+        <w:tc>
+          <w:tcPr>
+            <w:tcBorders>
+              <w:top w:val="single" w:color="CBD5E1" w:sz="4"/>
+              <w:left w:val="single" w:color="CBD5E1" w:sz="4"/>
+              <w:bottom w:val="single" w:color="CBD5E1" w:sz="4"/>
+              <w:right w:val="single" w:color="CBD5E1" w:sz="4"/>
+            </w:tcBorders>
+          </w:tcPr>
+          <w:p>
+            <w:r>
+              <w:rPr>
+                <w:b/>
+                <w:bCs/>
+                <w:color w:val="047857"/>
+              </w:rPr>
+              <w:t xml:space="preserve">~$4.06 AUD ($2.61 USD)</w:t>
+            </w:r>
+          </w:p>
+        </w:tc>
+        <w:tc>
+          <w:tcPr>
+            <w:tcBorders>
+              <w:top w:val="single" w:color="CBD5E1" w:sz="4"/>
+              <w:left w:val="single" w:color="CBD5E1" w:sz="4"/>
+              <w:bottom w:val="single" w:color="CBD5E1" w:sz="4"/>
+              <w:right w:val="single" w:color="CBD5E1" w:sz="4"/>
+            </w:tcBorders>
+          </w:tcPr>
+          <w:p>
+            <w:r>
+              <w:t xml:space="preserve">$600 – $3,000+ AUD</w:t>
             </w:r>
           </w:p>
         </w:tc>
@@ -1126,52 +1020,52 @@
           </w:tcPr>
           <w:p>
             <w:r>
-              <w:t xml:space="preserve">1,000 leads / month</w:t>
-            </w:r>
-          </w:p>
-        </w:tc>
-        <w:tc>
-          <w:tcPr>
-            <w:tcBorders>
-              <w:top w:val="single" w:color="CBD5E1" w:sz="4"/>
-              <w:left w:val="single" w:color="CBD5E1" w:sz="4"/>
-              <w:bottom w:val="single" w:color="CBD5E1" w:sz="4"/>
-              <w:right w:val="single" w:color="CBD5E1" w:sz="4"/>
-            </w:tcBorders>
-          </w:tcPr>
-          <w:p>
-            <w:r>
-              <w:t xml:space="preserve">~$1.55 AUD</w:t>
-            </w:r>
-          </w:p>
-        </w:tc>
-        <w:tc>
-          <w:tcPr>
-            <w:tcBorders>
-              <w:top w:val="single" w:color="CBD5E1" w:sz="4"/>
-              <w:left w:val="single" w:color="CBD5E1" w:sz="4"/>
-              <w:bottom w:val="single" w:color="CBD5E1" w:sz="4"/>
-              <w:right w:val="single" w:color="CBD5E1" w:sz="4"/>
-            </w:tcBorders>
-          </w:tcPr>
-          <w:p>
-            <w:r>
-              <w:t xml:space="preserve">~$2.50 AUD (Covered by Free Tier)</w:t>
-            </w:r>
-          </w:p>
-        </w:tc>
-        <w:tc>
-          <w:tcPr>
-            <w:tcBorders>
-              <w:top w:val="single" w:color="CBD5E1" w:sz="4"/>
-              <w:left w:val="single" w:color="CBD5E1" w:sz="4"/>
-              <w:bottom w:val="single" w:color="CBD5E1" w:sz="4"/>
-              <w:right w:val="single" w:color="CBD5E1" w:sz="4"/>
-            </w:tcBorders>
-          </w:tcPr>
-          <w:p>
-            <w:r>
-              <w:t xml:space="preserve">$300 – $800 AUD</w:t>
+              <w:t xml:space="preserve">Future 500 leads / month</w:t>
+            </w:r>
+          </w:p>
+        </w:tc>
+        <w:tc>
+          <w:tcPr>
+            <w:tcBorders>
+              <w:top w:val="single" w:color="CBD5E1" w:sz="4"/>
+              <w:left w:val="single" w:color="CBD5E1" w:sz="4"/>
+              <w:bottom w:val="single" w:color="CBD5E1" w:sz="4"/>
+              <w:right w:val="single" w:color="CBD5E1" w:sz="4"/>
+            </w:tcBorders>
+          </w:tcPr>
+          <w:p>
+            <w:r>
+              <w:t xml:space="preserve">$0.00 (Covered by Free Tier)</w:t>
+            </w:r>
+          </w:p>
+        </w:tc>
+        <w:tc>
+          <w:tcPr>
+            <w:tcBorders>
+              <w:top w:val="single" w:color="CBD5E1" w:sz="4"/>
+              <w:left w:val="single" w:color="CBD5E1" w:sz="4"/>
+              <w:bottom w:val="single" w:color="CBD5E1" w:sz="4"/>
+              <w:right w:val="single" w:color="CBD5E1" w:sz="4"/>
+            </w:tcBorders>
+          </w:tcPr>
+          <w:p>
+            <w:r>
+              <w:t xml:space="preserve">$0.00 (Free Quota)</w:t>
+            </w:r>
+          </w:p>
+        </w:tc>
+        <w:tc>
+          <w:tcPr>
+            <w:tcBorders>
+              <w:top w:val="single" w:color="CBD5E1" w:sz="4"/>
+              <w:left w:val="single" w:color="CBD5E1" w:sz="4"/>
+              <w:bottom w:val="single" w:color="CBD5E1" w:sz="4"/>
+              <w:right w:val="single" w:color="CBD5E1" w:sz="4"/>
+            </w:tcBorders>
+          </w:tcPr>
+          <w:p>
+            <w:r>
+              <w:t xml:space="preserve">$150 – $400 AUD</w:t>
             </w:r>
           </w:p>
         </w:tc>
@@ -1188,52 +1082,52 @@
           </w:tcPr>
           <w:p>
             <w:r>
-              <w:t xml:space="preserve">3,000 leads / month</w:t>
-            </w:r>
-          </w:p>
-        </w:tc>
-        <w:tc>
-          <w:tcPr>
-            <w:tcBorders>
-              <w:top w:val="single" w:color="CBD5E1" w:sz="4"/>
-              <w:left w:val="single" w:color="CBD5E1" w:sz="4"/>
-              <w:bottom w:val="single" w:color="CBD5E1" w:sz="4"/>
-              <w:right w:val="single" w:color="CBD5E1" w:sz="4"/>
-            </w:tcBorders>
-          </w:tcPr>
-          <w:p>
-            <w:r>
-              <w:t xml:space="preserve">~$4.65 AUD</w:t>
-            </w:r>
-          </w:p>
-        </w:tc>
-        <w:tc>
-          <w:tcPr>
-            <w:tcBorders>
-              <w:top w:val="single" w:color="CBD5E1" w:sz="4"/>
-              <w:left w:val="single" w:color="CBD5E1" w:sz="4"/>
-              <w:bottom w:val="single" w:color="CBD5E1" w:sz="4"/>
-              <w:right w:val="single" w:color="CBD5E1" w:sz="4"/>
-            </w:tcBorders>
-          </w:tcPr>
-          <w:p>
-            <w:r>
-              <w:t xml:space="preserve">~$45.00 – $65.00 AUD</w:t>
-            </w:r>
-          </w:p>
-        </w:tc>
-        <w:tc>
-          <w:tcPr>
-            <w:tcBorders>
-              <w:top w:val="single" w:color="CBD5E1" w:sz="4"/>
-              <w:left w:val="single" w:color="CBD5E1" w:sz="4"/>
-              <w:bottom w:val="single" w:color="CBD5E1" w:sz="4"/>
-              <w:right w:val="single" w:color="CBD5E1" w:sz="4"/>
-            </w:tcBorders>
-          </w:tcPr>
-          <w:p>
-            <w:r>
-              <w:t xml:space="preserve">$900 – $2,400 AUD</w:t>
+              <w:t xml:space="preserve">Future 1,000 leads / month</w:t>
+            </w:r>
+          </w:p>
+        </w:tc>
+        <w:tc>
+          <w:tcPr>
+            <w:tcBorders>
+              <w:top w:val="single" w:color="CBD5E1" w:sz="4"/>
+              <w:left w:val="single" w:color="CBD5E1" w:sz="4"/>
+              <w:bottom w:val="single" w:color="CBD5E1" w:sz="4"/>
+              <w:right w:val="single" w:color="CBD5E1" w:sz="4"/>
+            </w:tcBorders>
+          </w:tcPr>
+          <w:p>
+            <w:r>
+              <w:t xml:space="preserve">~$2.50 AUD (Covered by Free Tier)</w:t>
+            </w:r>
+          </w:p>
+        </w:tc>
+        <w:tc>
+          <w:tcPr>
+            <w:tcBorders>
+              <w:top w:val="single" w:color="CBD5E1" w:sz="4"/>
+              <w:left w:val="single" w:color="CBD5E1" w:sz="4"/>
+              <w:bottom w:val="single" w:color="CBD5E1" w:sz="4"/>
+              <w:right w:val="single" w:color="CBD5E1" w:sz="4"/>
+            </w:tcBorders>
+          </w:tcPr>
+          <w:p>
+            <w:r>
+              <w:t xml:space="preserve">~$1.55 AUD</w:t>
+            </w:r>
+          </w:p>
+        </w:tc>
+        <w:tc>
+          <w:tcPr>
+            <w:tcBorders>
+              <w:top w:val="single" w:color="CBD5E1" w:sz="4"/>
+              <w:left w:val="single" w:color="CBD5E1" w:sz="4"/>
+              <w:bottom w:val="single" w:color="CBD5E1" w:sz="4"/>
+              <w:right w:val="single" w:color="CBD5E1" w:sz="4"/>
+            </w:tcBorders>
+          </w:tcPr>
+          <w:p>
+            <w:r>
+              <w:t xml:space="preserve">$300 – $800 AUD</w:t>
             </w:r>
           </w:p>
         </w:tc>
@@ -1250,7 +1144,84 @@
           </w:tcPr>
           <w:p>
             <w:r>
-              <w:t xml:space="preserve">10,000 leads / month</w:t>
+              <w:t xml:space="preserve">Future 3,000 leads / month</w:t>
+            </w:r>
+          </w:p>
+        </w:tc>
+        <w:tc>
+          <w:tcPr>
+            <w:tcBorders>
+              <w:top w:val="single" w:color="CBD5E1" w:sz="4"/>
+              <w:left w:val="single" w:color="CBD5E1" w:sz="4"/>
+              <w:bottom w:val="single" w:color="CBD5E1" w:sz="4"/>
+              <w:right w:val="single" w:color="CBD5E1" w:sz="4"/>
+            </w:tcBorders>
+          </w:tcPr>
+          <w:p>
+            <w:r>
+              <w:t xml:space="preserve">~$45.00 – $65.00 AUD</w:t>
+            </w:r>
+          </w:p>
+        </w:tc>
+        <w:tc>
+          <w:tcPr>
+            <w:tcBorders>
+              <w:top w:val="single" w:color="CBD5E1" w:sz="4"/>
+              <w:left w:val="single" w:color="CBD5E1" w:sz="4"/>
+              <w:bottom w:val="single" w:color="CBD5E1" w:sz="4"/>
+              <w:right w:val="single" w:color="CBD5E1" w:sz="4"/>
+            </w:tcBorders>
+          </w:tcPr>
+          <w:p>
+            <w:r>
+              <w:t xml:space="preserve">~$4.65 AUD</w:t>
+            </w:r>
+          </w:p>
+        </w:tc>
+        <w:tc>
+          <w:tcPr>
+            <w:tcBorders>
+              <w:top w:val="single" w:color="CBD5E1" w:sz="4"/>
+              <w:left w:val="single" w:color="CBD5E1" w:sz="4"/>
+              <w:bottom w:val="single" w:color="CBD5E1" w:sz="4"/>
+              <w:right w:val="single" w:color="CBD5E1" w:sz="4"/>
+            </w:tcBorders>
+          </w:tcPr>
+          <w:p>
+            <w:r>
+              <w:t xml:space="preserve">$900 – $2,400 AUD</w:t>
+            </w:r>
+          </w:p>
+        </w:tc>
+      </w:tr>
+      <w:tr>
+        <w:tc>
+          <w:tcPr>
+            <w:tcBorders>
+              <w:top w:val="single" w:color="CBD5E1" w:sz="4"/>
+              <w:left w:val="single" w:color="CBD5E1" w:sz="4"/>
+              <w:bottom w:val="single" w:color="CBD5E1" w:sz="4"/>
+              <w:right w:val="single" w:color="CBD5E1" w:sz="4"/>
+            </w:tcBorders>
+          </w:tcPr>
+          <w:p>
+            <w:r>
+              <w:t xml:space="preserve">Future 10,000 leads / month</w:t>
+            </w:r>
+          </w:p>
+        </w:tc>
+        <w:tc>
+          <w:tcPr>
+            <w:tcBorders>
+              <w:top w:val="single" w:color="CBD5E1" w:sz="4"/>
+              <w:left w:val="single" w:color="CBD5E1" w:sz="4"/>
+              <w:bottom w:val="single" w:color="CBD5E1" w:sz="4"/>
+              <w:right w:val="single" w:color="CBD5E1" w:sz="4"/>
+            </w:tcBorders>
+          </w:tcPr>
+          <w:p>
+            <w:r>
+              <w:t xml:space="preserve">~$220.00 AUD</w:t>
             </w:r>
           </w:p>
         </w:tc>
@@ -1266,21 +1237,6 @@
           <w:p>
             <w:r>
               <w:t xml:space="preserve">~$15.50 AUD</w:t>
-            </w:r>
-          </w:p>
-        </w:tc>
-        <w:tc>
-          <w:tcPr>
-            <w:tcBorders>
-              <w:top w:val="single" w:color="CBD5E1" w:sz="4"/>
-              <w:left w:val="single" w:color="CBD5E1" w:sz="4"/>
-              <w:bottom w:val="single" w:color="CBD5E1" w:sz="4"/>
-              <w:right w:val="single" w:color="CBD5E1" w:sz="4"/>
-            </w:tcBorders>
-          </w:tcPr>
-          <w:p>
-            <w:r>
-              <w:t xml:space="preserve">~$220.00 AUD</w:t>
             </w:r>
           </w:p>
         </w:tc>
@@ -1304,7 +1260,7 @@
     <w:p>
       <w:pPr>
         <w:pStyle w:val="Heading1"/>
-        <w:spacing w:after="140" w:before="280"/>
+        <w:spacing w:after="120" w:before="260"/>
       </w:pPr>
       <w:r>
         <w:rPr>
@@ -1314,7 +1270,7 @@
           <w:sz w:val="28"/>
           <w:szCs w:val="28"/>
         </w:rPr>
-        <w:t xml:space="preserve">5. Built-in Cost Safeguards</w:t>
+        <w:t xml:space="preserve">4. UI Workflow &amp; Enterprise Security</w:t>
       </w:r>
     </w:p>
     <w:p>
@@ -1323,10 +1279,10 @@
           <w:b/>
           <w:bCs/>
         </w:rPr>
-        <w:t xml:space="preserve">1. Permanent Database Caching: </w:t>
-      </w:r>
-      <w:r>
-        <w:t xml:space="preserve">Leads are never re-queried unless an admin explicitly clicks re-enrich.
+        <w:t xml:space="preserve">• Seamless 1-Click UI: </w:t>
+      </w:r>
+      <w:r>
+        <w:t xml:space="preserve">Reps click [Run Complete Intel (AI + Agent Reach)] on any lead, or select multiple leads and click [Batch Enrich]. The system executes both the direct website crawler and live Exa/LinkedIn indexing in parallel in under 8 seconds.
 </w:t>
       </w:r>
       <w:r>
@@ -1334,10 +1290,10 @@
           <w:b/>
           <w:bCs/>
         </w:rPr>
-        <w:t xml:space="preserve">2. Decoupled Actions: </w:t>
-      </w:r>
-      <w:r>
-        <w:t xml:space="preserve">Live web intelligence and LinkedIn decision-maker discovery can be triggered separately so search credits are only used where needed.
+        <w:t xml:space="preserve">• Zero Recurring Costs: </w:t>
+      </w:r>
+      <w:r>
+        <w:t xml:space="preserve">All enriched data is stored permanently in Firestore. Viewing leads, filtering tables, or making calls makes zero API calls.
 </w:t>
       </w:r>
       <w:r>
@@ -1345,10 +1301,10 @@
           <w:b/>
           <w:bCs/>
         </w:rPr>
-        <w:t xml:space="preserve">3. Regulated Concurrency Workers: </w:t>
-      </w:r>
-      <w:r>
-        <w:t xml:space="preserve">Batch jobs process in pools of 3 to 6 concurrent requests, guaranteeing the system never breaches provider rate limits or triggers surge fees.
+        <w:t xml:space="preserve">• Google Cloud Secret Manager: </w:t>
+      </w:r>
+      <w:r>
+        <w:t xml:space="preserve">The Exa API key is stored in GCP Secret Manager (projects/mailplus-outbound-leads-crm/secrets/EXA_API_KEY) and bound to App Hosting runtime IAM. Zero keys exist in GitHub.
 </w:t>
       </w:r>
       <w:r>
@@ -1356,16 +1312,16 @@
           <w:b/>
           <w:bCs/>
         </w:rPr>
-        <w:t xml:space="preserve">4. Graceful Fallbacks: </w:t>
-      </w:r>
-      <w:r>
-        <w:t xml:space="preserve">If an external semantic search or reader is unavailable, the system automatically falls back to raw HTML parsing without failing the batch job.</w:t>
+        <w:t xml:space="preserve">• Rate Limit Headroom: </w:t>
+      </w:r>
+      <w:r>
+        <w:t xml:space="preserve">Our dedicated Exa account provides 10 QPS (600 req/min). ProspectPlus batch workers operate at 3 to 6 concurrent requests (~1–2 QPS), running at 10% to 20% of the ceiling to guarantee reliable execution without throttling.</w:t>
       </w:r>
     </w:p>
     <w:p>
       <w:pPr>
         <w:pStyle w:val="Heading1"/>
-        <w:spacing w:after="140" w:before="280"/>
+        <w:spacing w:after="120" w:before="260"/>
       </w:pPr>
       <w:r>
         <w:rPr>
@@ -1375,12 +1331,12 @@
           <w:sz w:val="28"/>
           <w:szCs w:val="28"/>
         </w:rPr>
-        <w:t xml:space="preserve">6. Conclusion &amp; Recommendation</w:t>
+        <w:t xml:space="preserve">5. Conclusion &amp; Leadership Recommendation</w:t>
       </w:r>
     </w:p>
     <w:p>
       <w:r>
-        <w:t xml:space="preserve">The AI Lead Enrichment infrastructure delivers outstanding ROI. The 3,000 leads processed on October 12 incurred approximately $4.00 AUD total in token and compute costs, delivering custom logistics intelligence, verified branches, and targeted openers at a 99.5% savings relative to commercial enterprise vendors. With the newly connected Exa account in Google Secret Manager, the team gains real-time carrier intelligence and LinkedIn contacts while retaining rock-solid security and predictable, sub-cent unit costs.</w:t>
+        <w:t xml:space="preserve">ProspectPlus delivers enterprise-grade logistics intelligence with unprecedented cost efficiency. The 3,000 leads processed on October 12 cost only ~$4.00 AUD total under direct scraping and Gemini AI. The unified 1-click engine now provides real-time carrier evidence and LinkedIn contacts for high-converting sales conversations at a fraction of commercial vendor fees, delivering annual savings of over $15,000 to $30,000 AUD.</w:t>
       </w:r>
     </w:p>
     <w:sectPr>
@@ -1516,7 +1472,7 @@
         <w:sz w:val="18"/>
         <w:szCs w:val="18"/>
       </w:rPr>
-      <w:t xml:space="preserve">ProspectPlus | AI Lead Enrichment Cost &amp; Infrastructure Guide</w:t>
+      <w:t xml:space="preserve">ProspectPlus | Lead Intelligence &amp; Cost Analysis</w:t>
     </w:r>
   </w:p>
 </w:hdr>

</xml_diff>